<commit_message>
docs: agregar apartado de repositorio del proyecto en portada y seccion 1.1
</commit_message>
<xml_diff>
--- a/docs/aptc106_s11grupo3.docx
+++ b/docs/aptc106_s11grupo3.docx
@@ -169,7 +169,7 @@
     </w:p>
     <w:p>
       <w:pPr>
-        <w:spacing w:lineRule="auto" w:line="276" w:after="40" w:before="0"/>
+        <w:spacing w:lineRule="auto" w:line="276" w:after="200" w:before="0"/>
         <w:jc w:val="center"/>
       </w:pPr>
       <w:r>
@@ -180,6 +180,36 @@
           <w:sz w:val="22"/>
         </w:rPr>
         <w:t>Docente: Ernesto Vivanco</w:t>
+      </w:r>
+    </w:p>
+    <w:p>
+      <w:pPr>
+        <w:spacing w:lineRule="auto" w:line="276" w:after="40" w:before="0"/>
+        <w:jc w:val="center"/>
+      </w:pPr>
+      <w:r>
+        <w:rPr>
+          <w:rFonts w:ascii="Arial" w:hAnsi="Arial" w:cs="Arial" w:eastAsia="Arial"/>
+          <w:b/>
+          <w:color w:val="C8102E"/>
+          <w:sz w:val="22"/>
+        </w:rPr>
+        <w:t>Repositorio del proyecto</w:t>
+      </w:r>
+    </w:p>
+    <w:p>
+      <w:pPr>
+        <w:spacing w:lineRule="auto" w:line="276" w:after="200" w:before="0"/>
+        <w:jc w:val="center"/>
+      </w:pPr>
+      <w:r>
+        <w:rPr>
+          <w:rFonts w:ascii="Arial" w:hAnsi="Arial" w:cs="Arial" w:eastAsia="Arial"/>
+          <w:b/>
+          <w:color w:val="222222"/>
+          <w:sz w:val="22"/>
+        </w:rPr>
+        <w:t>https://github.com/omoncada730/foodplease-entregable7</w:t>
       </w:r>
     </w:p>
     <w:p>
@@ -232,6 +262,25 @@
           <w:sz w:val="22"/>
         </w:rPr>
         <w:t>1. Introduccion</w:t>
+        <w:tab/>
+        <w:t>3</w:t>
+      </w:r>
+    </w:p>
+    <w:p>
+      <w:pPr>
+        <w:tabs>
+          <w:tab w:pos="8787" w:val="right" w:leader="dot"/>
+        </w:tabs>
+        <w:spacing w:line="276" w:lineRule="auto" w:after="40"/>
+      </w:pPr>
+      <w:r>
+        <w:rPr>
+          <w:rFonts w:ascii="Arial" w:hAnsi="Arial" w:cs="Arial" w:eastAsia="Arial"/>
+          <w:b w:val="0"/>
+          <w:color w:val="222222"/>
+          <w:sz w:val="22"/>
+        </w:rPr>
+        <w:t>1.1 Repositorio del proyecto</w:t>
         <w:tab/>
         <w:t>3</w:t>
       </w:r>
@@ -447,6 +496,36 @@
           <w:sz w:val="22"/>
         </w:rPr>
         <w:t>Estructura. El documento se organiza en ocho secciones: introduccion, analisis critico, propuesta tecnica, despliegue, validacion del MVP, post mortem, conclusiones y bibliografia en formato APA.</w:t>
+      </w:r>
+    </w:p>
+    <w:p>
+      <w:pPr>
+        <w:spacing w:before="120" w:after="80" w:lineRule="auto" w:line="276"/>
+        <w:jc w:val="left"/>
+      </w:pPr>
+      <w:r>
+        <w:rPr>
+          <w:rFonts w:ascii="Arial" w:hAnsi="Arial" w:cs="Arial" w:eastAsia="Arial"/>
+          <w:b/>
+          <w:color w:val="222222"/>
+          <w:sz w:val="24"/>
+        </w:rPr>
+        <w:t>1.1 Repositorio del proyecto</w:t>
+      </w:r>
+    </w:p>
+    <w:p>
+      <w:pPr>
+        <w:spacing w:lineRule="auto" w:line="276" w:after="80" w:before="0"/>
+        <w:jc w:val="both"/>
+      </w:pPr>
+      <w:r>
+        <w:rPr>
+          <w:rFonts w:ascii="Arial" w:hAnsi="Arial" w:cs="Arial" w:eastAsia="Arial"/>
+          <w:b w:val="0"/>
+          <w:color w:val="222222"/>
+          <w:sz w:val="22"/>
+        </w:rPr>
+        <w:t>Todo el codigo fuente, los Architecture Decision Records y el presente documento estan publicados en el repositorio GitHub: https://github.com/omoncada730/foodplease-entregable7. El repositorio sigue una estructura de monorepo con tres carpetas principales: backend/ (aplicacion Flask con API REST y PWA), mobile/ (app hibrida Capacitor para iOS y Android) y docs/ (los cinco ADR y la copia de este informe).</w:t>
       </w:r>
     </w:p>
     <w:p>

</xml_diff>